<commit_message>
vault backup: 2026-09-01 19:49:28
</commit_message>
<xml_diff>
--- a/Investigare/Avventura Tanto Rumore/DOSSIER_GM.docx
+++ b/Investigare/Avventura Tanto Rumore/DOSSIER_GM.docx
@@ -109,6 +109,72 @@
           <w:sz w:val="19"/>
         </w:rPr>
         <w:t>Contiene la soluzione del caso. Non va mostrato ai giocatori.</w:t>
+      </w:r>
+    </w:p>
+    <w:p>
+      <w:pPr>
+        <w:keepNext/>
+        <w:spacing w:before="160" w:after="80"/>
+        <w:pBdr>
+          <w:bottom w:val="single" w:sz="10" w:color="B49650" w:space="2"/>
+        </w:pBdr>
+      </w:pPr>
+      <w:r>
+        <w:rPr>
+          <w:b/>
+          <w:color w:val="1A1A2E"/>
+          <w:sz w:val="26"/>
+        </w:rPr>
+        <w:t>IL BRIEFING DEL CAPO — PER APRIRE</w:t>
+      </w:r>
+      <w:r>
+        <w:rPr>
+          <w:color w:val="B49650"/>
+          <w:sz w:val="24"/>
+        </w:rPr>
+        <w:t xml:space="preserve">   訓示</w:t>
+      </w:r>
+    </w:p>
+    <w:p>
+      <w:pPr>
+        <w:spacing w:after="80" w:before="0"/>
+      </w:pPr>
+      <w:r>
+        <w:rPr>
+          <w:b w:val="0"/>
+          <w:i/>
+          <w:color w:val="706A5E"/>
+          <w:sz w:val="19"/>
+        </w:rPr>
+        <w:t>Domenica 25 maggio 1997, mattina. Il capo ispettore alla squadra — da leggere ai giocatori così com'è:</w:t>
+      </w:r>
+    </w:p>
+    <w:p>
+      <w:pPr>
+        <w:spacing w:after="60" w:before="0"/>
+        <w:ind w:left="227"/>
+      </w:pPr>
+      <w:r>
+        <w:rPr>
+          <w:b w:val="0"/>
+          <w:i/>
+          <w:sz w:val="22"/>
+        </w:rPr>
+        <w:t>«Sabato sera, 21:15, snack bar SnakUp, Shimogyō. Shimada Yuta, ventun anni, studente di medicina che faceva le serate lì per pagarsi gli studi: un colpo alla nuca, da dietro, oggetto contundente. Morto prima che arrivasse l'ambulanza. Quattro, forse cinque giovani: entrati, trenta secondi di lite, il colpo, e via in moto. Nessun nome, nessuna faccia — l'unica cosa che tutti ricordano è il rumore: quel rombo di scarichi tagliati che ha svegliato mezza via.</w:t>
+      </w:r>
+    </w:p>
+    <w:p>
+      <w:pPr>
+        <w:spacing w:after="60" w:before="0"/>
+        <w:ind w:left="227"/>
+      </w:pPr>
+      <w:r>
+        <w:rPr>
+          <w:b w:val="0"/>
+          <w:i/>
+          <w:sz w:val="22"/>
+        </w:rPr>
+        <w:t>Il titolare e la cameriera erano dentro. La madre e la sorella aspettano da stanotte che qualcuno gli spieghi perché. Il caso è vostro: portatemi chi ha dato quel colpo — prima che i giornali ci mangino vivi.»</w:t>
       </w:r>
     </w:p>
     <w:p>
@@ -1115,7 +1181,7 @@
           <w:color w:val="8B1A1A"/>
           <w:sz w:val="20"/>
         </w:rPr>
-        <w:t xml:space="preserve">   la vittima</w:t>
+        <w:t xml:space="preserve">   LA VITTIMA</w:t>
       </w:r>
     </w:p>
     <w:p>
@@ -1354,7 +1420,7 @@
           <w:color w:val="8B1A1A"/>
           <w:sz w:val="20"/>
         </w:rPr>
-        <w:t xml:space="preserve">   l'assassino</w:t>
+        <w:t xml:space="preserve">   L'ASSASSINO — capo della banda</w:t>
       </w:r>
     </w:p>
     <w:p>
@@ -1769,6 +1835,90 @@
     </w:tbl>
     <w:p>
       <w:pPr>
+        <w:spacing w:after="40" w:before="120"/>
+      </w:pPr>
+      <w:r>
+        <w:rPr>
+          <w:b/>
+          <w:i w:val="0"/>
+          <w:color w:val="B49650"/>
+          <w:sz w:val="19"/>
+        </w:rPr>
+        <w:t>Nella storia (verità del GM)</w:t>
+      </w:r>
+    </w:p>
+    <w:p>
+      <w:pPr>
+        <w:spacing w:after="20" w:before="0"/>
+        <w:ind w:left="283"/>
+      </w:pPr>
+      <w:r>
+        <w:rPr>
+          <w:b w:val="0"/>
+          <w:i w:val="0"/>
+          <w:sz w:val="19"/>
+        </w:rPr>
+        <w:t>· 1997-05-11 11:04 · Sede Banda — Tanaka Takayuki avvisa il capo Matsui Kenta, che incarica il suo braccio destro Sugimoto Hideki di indagare i due.</w:t>
+      </w:r>
+    </w:p>
+    <w:p>
+      <w:pPr>
+        <w:spacing w:after="20" w:before="0"/>
+        <w:ind w:left="283"/>
+      </w:pPr>
+      <w:r>
+        <w:rPr>
+          <w:b w:val="0"/>
+          <w:i w:val="0"/>
+          <w:sz w:val="19"/>
+        </w:rPr>
+        <w:t>· 1997-05-24 21:14 · SnakUp — La banda al completo arriva sul lavoro della vittima, con scuse, cosi diranno i testimoni, attaccano briga con la vittima che viene uccisa con un colpo alle spalle con un oggetto contundente. Se mostrate le foto vengono riconosciuti dal collega e dal titolare ma il titolare non collaborano subito ha paura di ritorsioni, la dipendente dice che era nel retro ed è rientrata in sala solo dopo il colpo; in realtà era in sala e ha visto tutto.</w:t>
+      </w:r>
+    </w:p>
+    <w:p>
+      <w:pPr>
+        <w:spacing w:after="40" w:before="120"/>
+      </w:pPr>
+      <w:r>
+        <w:rPr>
+          <w:b/>
+          <w:i w:val="0"/>
+          <w:color w:val="B49650"/>
+          <w:sz w:val="19"/>
+        </w:rPr>
+        <w:t>I suoi legami (En)</w:t>
+      </w:r>
+    </w:p>
+    <w:p>
+      <w:pPr>
+        <w:spacing w:after="20" w:before="0"/>
+        <w:ind w:left="283"/>
+      </w:pPr>
+      <w:r>
+        <w:rPr>
+          <w:b w:val="0"/>
+          <w:i w:val="0"/>
+          <w:sz w:val="19"/>
+        </w:rPr>
+        <w:t>· con Shimada Yuta (assassino e vittima): En suo verso l'altro -5 · in risposta -1</w:t>
+      </w:r>
+    </w:p>
+    <w:p>
+      <w:pPr>
+        <w:spacing w:after="20" w:before="0"/>
+        <w:ind w:left="283"/>
+      </w:pPr>
+      <w:r>
+        <w:rPr>
+          <w:b w:val="0"/>
+          <w:i w:val="0"/>
+          <w:sz w:val="19"/>
+        </w:rPr>
+        <w:t>· con Watanabe Noriko (ex fidanzati): En suo verso l'altro 5 · in risposta 2</w:t>
+      </w:r>
+    </w:p>
+    <w:p>
+      <w:pPr>
         <w:spacing w:before="100" w:after="40"/>
       </w:pPr>
       <w:r>
@@ -1827,6 +1977,14 @@
         </w:rPr>
         <w:t xml:space="preserve">  青木 秀樹</w:t>
       </w:r>
+      <w:r>
+        <w:rPr>
+          <w:i/>
+          <w:color w:val="706A5E"/>
+          <w:sz w:val="20"/>
+        </w:rPr>
+        <w:t xml:space="preserve">   IL MIGLIORE AMICO — compagno di classe</w:t>
+      </w:r>
     </w:p>
     <w:p>
       <w:pPr>
@@ -1872,17 +2030,239 @@
     </w:p>
     <w:p>
       <w:pPr>
-        <w:spacing w:after="40" w:before="0"/>
+        <w:spacing w:after="40" w:before="120"/>
+      </w:pPr>
+      <w:r>
+        <w:rPr>
+          <w:b/>
+          <w:i w:val="0"/>
+          <w:color w:val="B49650"/>
+          <w:sz w:val="19"/>
+        </w:rPr>
+        <w:t>Cosa sa</w:t>
+      </w:r>
+    </w:p>
+    <w:p>
+      <w:pPr>
+        <w:spacing w:after="60" w:before="0"/>
+        <w:ind w:left="227"/>
+      </w:pPr>
+      <w:r>
+        <w:rPr>
+          <w:b w:val="0"/>
+          <w:i w:val="0"/>
+          <w:sz w:val="21"/>
+        </w:rPr>
+        <w:t>Tutto della storia con Watanabe Noriko: conosciuti a fine aprile, primo appuntamento il 10 maggio. Sa che Noriko aveva un ex «di quelli con le moto» che non la lasciava in pace e di cui lei aveva paura — ma NON ne sa il nome. Sa che negli ultimi giorni Yuta era nervoso: una moto smarmittata passava sotto la scuola, e un tizio grosso in tuta da lavoro li osservava (era Sugimoto, ma Aoki non lo sa). Sa come si sentivano: lui la avvisava sul cercapersone dal telefono dello SnakUp o dalla cabina verso Sanjō — utile ai PG per attribuire le voci del tabulato.</w:t>
+      </w:r>
+    </w:p>
+    <w:p>
+      <w:pPr>
+        <w:spacing w:after="40" w:before="120"/>
+      </w:pPr>
+      <w:r>
+        <w:rPr>
+          <w:b/>
+          <w:i w:val="0"/>
+          <w:color w:val="B49650"/>
+          <w:sz w:val="19"/>
+        </w:rPr>
+        <w:t>Cosa NON sa</w:t>
+      </w:r>
+    </w:p>
+    <w:p>
+      <w:pPr>
+        <w:spacing w:after="60" w:before="0"/>
+        <w:ind w:left="227"/>
+      </w:pPr>
+      <w:r>
+        <w:rPr>
+          <w:b w:val="0"/>
+          <w:i w:val="0"/>
+          <w:sz w:val="21"/>
+        </w:rPr>
+        <w:t>Il nome dell'ex e l'esistenza della banda. Nulla dello spaccio. Non era presente al fatto: sabato sera era a casa a studiare.</w:t>
+      </w:r>
+    </w:p>
+    <w:p>
+      <w:pPr>
+        <w:spacing w:after="40" w:before="120"/>
+      </w:pPr>
+      <w:r>
+        <w:rPr>
+          <w:b/>
+          <w:i w:val="0"/>
+          <w:color w:val="B49650"/>
+          <w:sz w:val="19"/>
+        </w:rPr>
+        <w:t>Come si comporta, cosa nasconde</w:t>
+      </w:r>
+    </w:p>
+    <w:p>
+      <w:pPr>
+        <w:spacing w:after="60" w:before="0"/>
+        <w:ind w:left="227"/>
+      </w:pPr>
+      <w:r>
+        <w:rPr>
+          <w:b w:val="0"/>
+          <w:i w:val="0"/>
+          <w:sz w:val="21"/>
+        </w:rPr>
+        <w:t>Sconvolto ma è l'UNICO che vuole parlare: collaborativo, preciso, si sente in colpa («dovevo insistere che andasse alla polizia»). Il GM lo usa per rimettere in carreggiata i giocatori: conferma Noriko, l'ex con le moto, il pedinamento — e spiega da dove chiamava Yuta.</w:t>
+      </w:r>
+    </w:p>
+    <w:p>
+      <w:pPr>
+        <w:spacing w:after="40" w:before="120"/>
+      </w:pPr>
+      <w:r>
+        <w:rPr>
+          <w:b/>
+          <w:i w:val="0"/>
+          <w:color w:val="B49650"/>
+          <w:sz w:val="19"/>
+        </w:rPr>
+        <w:t>I suoi legami (En)</w:t>
+      </w:r>
+    </w:p>
+    <w:p>
+      <w:pPr>
+        <w:spacing w:after="20" w:before="0"/>
+        <w:ind w:left="283"/>
+      </w:pPr>
+      <w:r>
+        <w:rPr>
+          <w:b w:val="0"/>
+          <w:i w:val="0"/>
+          <w:sz w:val="19"/>
+        </w:rPr>
+        <w:t>· con Shimada Yasuhiro: En suo verso l'altro 0 · in risposta 1</w:t>
+      </w:r>
+    </w:p>
+    <w:p>
+      <w:pPr>
+        <w:spacing w:after="20" w:before="0"/>
+        <w:ind w:left="283"/>
+      </w:pPr>
+      <w:r>
+        <w:rPr>
+          <w:b w:val="0"/>
+          <w:i w:val="0"/>
+          <w:sz w:val="19"/>
+        </w:rPr>
+        <w:t>· con Shimada Yuta (compagni di scuola): En suo verso l'altro 2 · in risposta 1</w:t>
+      </w:r>
+    </w:p>
+    <w:p>
+      <w:pPr>
+        <w:spacing w:before="100" w:after="40"/>
+      </w:pPr>
+      <w:r>
+        <w:rPr>
+          <w:b/>
+          <w:color w:val="1A1A2E"/>
+          <w:sz w:val="19"/>
+        </w:rPr>
+        <w:t xml:space="preserve">Statistiche   </w:t>
+      </w:r>
+      <w:r>
+        <w:rPr>
+          <w:sz w:val="19"/>
+        </w:rPr>
+        <w:t>Distacco 4 · Pazienza 5 · Silenzio 4 · Lucidità 6 · Ascolto 6 · Presenza 4 · Ki 6</w:t>
+      </w:r>
+      <w:r>
+        <w:rPr>
+          <w:i/>
+          <w:color w:val="706A5E"/>
+          <w:sz w:val="18"/>
+        </w:rPr>
+        <w:t xml:space="preserve">   (profilo: studente)</w:t>
+      </w:r>
+    </w:p>
+    <w:p>
+      <w:pPr>
+        <w:spacing w:after="40" w:before="120"/>
+      </w:pPr>
+      <w:r>
+        <w:rPr>
+          <w:b/>
+          <w:i w:val="0"/>
+          <w:color w:val="B49650"/>
+          <w:sz w:val="19"/>
+        </w:rPr>
+        <w:t>La sua deposizione</w:t>
+      </w:r>
+    </w:p>
+    <w:p>
+      <w:pPr>
+        <w:spacing w:after="60" w:before="0"/>
         <w:ind w:left="227"/>
       </w:pPr>
       <w:r>
         <w:rPr>
           <w:b w:val="0"/>
           <w:i/>
-          <w:color w:val="8B1A1A"/>
-          <w:sz w:val="19"/>
-        </w:rPr>
-        <w:t>Scheda non compilata: manca cosa sa, come si comporta e la deposizione. Al tavolo si improvvisa.</w:t>
+          <w:sz w:val="20"/>
+        </w:rPr>
+        <w:t>Sono Aoki Hideki, ventun anni. Con Yuta eravamo in classe insieme da anni: i compiti a casa sua, gli esami preparati allo stesso tavolo. Il suo migliore amico, credo. Lui il mio di sicuro.</w:t>
+      </w:r>
+    </w:p>
+    <w:p>
+      <w:pPr>
+        <w:spacing w:after="60" w:before="0"/>
+        <w:ind w:left="227"/>
+      </w:pPr>
+      <w:r>
+        <w:rPr>
+          <w:b w:val="0"/>
+          <w:i/>
+          <w:sz w:val="20"/>
+        </w:rPr>
+        <w:t>Di Noriko mi aveva detto tutto: si erano conosciuti a fine aprile, e il dieci maggio erano usciti insieme la prima volta. Era felice come non l'avevo mai visto. Ma c'era un problema, e l'aveva detto solo a me: lei aveva un ex che non la lasciava in pace. Uno di quelli con le moto. Il nome non lo so — non me l'ha detto, forse non lo sapeva bene neanche lui. So che lei ne aveva paura.</w:t>
+      </w:r>
+    </w:p>
+    <w:p>
+      <w:pPr>
+        <w:spacing w:after="60" w:before="0"/>
+        <w:ind w:left="227"/>
+      </w:pPr>
+      <w:r>
+        <w:rPr>
+          <w:b w:val="0"/>
+          <w:i/>
+          <w:sz w:val="20"/>
+        </w:rPr>
+        <w:t>Le ultime due settimane Yuta era nervoso. Diceva che una moto smarmittata passava sotto la scuola, sempre la stessa. E una volta, alla fermata, c'era un tizio grosso, in tuta da lavoro, che ci guardava senza guardare. Gli ho detto: vai alla polizia. Mi ha risposto: «Non voglio guai. Finisce da sola.»</w:t>
+      </w:r>
+    </w:p>
+    <w:p>
+      <w:pPr>
+        <w:spacing w:after="60" w:before="0"/>
+        <w:ind w:left="227"/>
+      </w:pPr>
+      <w:r>
+        <w:rPr>
+          <w:b w:val="0"/>
+          <w:i/>
+          <w:sz w:val="20"/>
+        </w:rPr>
+        <w:t>Si sentivano col cercapersone di lei, coi numeri, come si fa tra noi. Lui la avvisava dal telefono del locale dove lavorava, o dalla cabina verso Sanjō quando usciva da lezione. A casa non poteva chiamarla: c'è la merceria, rispondono i genitori.</w:t>
+      </w:r>
+    </w:p>
+    <w:p>
+      <w:pPr>
+        <w:spacing w:after="60" w:before="0"/>
+        <w:ind w:left="227"/>
+      </w:pPr>
+      <w:r>
+        <w:rPr>
+          <w:b w:val="0"/>
+          <w:i/>
+          <w:sz w:val="20"/>
+        </w:rPr>
+        <w:t>Dovevo insistere. Questo lo so io, e me lo porto dietro.</w:t>
       </w:r>
     </w:p>
     <w:p>
@@ -1917,6 +2297,14 @@
           <w:sz w:val="23"/>
         </w:rPr>
         <w:t xml:space="preserve">  千葉 裕子</w:t>
+      </w:r>
+      <w:r>
+        <w:rPr>
+          <w:i/>
+          <w:color w:val="706A5E"/>
+          <w:sz w:val="20"/>
+        </w:rPr>
+        <w:t xml:space="preserve">   LA CAMERIERA dello SnakUp — testimone chiave (mente)</w:t>
       </w:r>
     </w:p>
     <w:p>
@@ -2082,6 +2470,76 @@
     </w:tbl>
     <w:p>
       <w:pPr>
+        <w:spacing w:after="40" w:before="120"/>
+      </w:pPr>
+      <w:r>
+        <w:rPr>
+          <w:b/>
+          <w:i w:val="0"/>
+          <w:color w:val="B49650"/>
+          <w:sz w:val="19"/>
+        </w:rPr>
+        <w:t>Nella storia (verità del GM)</w:t>
+      </w:r>
+    </w:p>
+    <w:p>
+      <w:pPr>
+        <w:spacing w:after="20" w:before="0"/>
+        <w:ind w:left="283"/>
+      </w:pPr>
+      <w:r>
+        <w:rPr>
+          <w:b w:val="0"/>
+          <w:i w:val="0"/>
+          <w:sz w:val="19"/>
+        </w:rPr>
+        <w:t>· 1997-05-11 18:00 · SnakUp — Shimada Yuta parla con il suo collega di lavoro della uscita fatta con Watanabe Noriko</w:t>
+      </w:r>
+    </w:p>
+    <w:p>
+      <w:pPr>
+        <w:spacing w:after="20" w:before="0"/>
+        <w:ind w:left="283"/>
+      </w:pPr>
+      <w:r>
+        <w:rPr>
+          <w:b w:val="0"/>
+          <w:i w:val="0"/>
+          <w:sz w:val="19"/>
+        </w:rPr>
+        <w:t>· 1997-05-24 21:14 · SnakUp — La banda al completo arriva sul lavoro della vittima, con scuse, cosi diranno i testimoni, attaccano briga con la vittima che viene uccisa con un colpo alle spalle con un oggetto contundente. Se mostrate le foto vengono riconosciuti dal collega e dal titolare ma il titolare non collaborano subito ha paura di ritorsioni, la dipendente dice che era nel retro ed è rientrata in sala solo dopo il colpo; in realtà era in sala e ha visto tutto.</w:t>
+      </w:r>
+    </w:p>
+    <w:p>
+      <w:pPr>
+        <w:spacing w:after="40" w:before="120"/>
+      </w:pPr>
+      <w:r>
+        <w:rPr>
+          <w:b/>
+          <w:i w:val="0"/>
+          <w:color w:val="B49650"/>
+          <w:sz w:val="19"/>
+        </w:rPr>
+        <w:t>I suoi legami (En)</w:t>
+      </w:r>
+    </w:p>
+    <w:p>
+      <w:pPr>
+        <w:spacing w:after="20" w:before="0"/>
+        <w:ind w:left="283"/>
+      </w:pPr>
+      <w:r>
+        <w:rPr>
+          <w:b w:val="0"/>
+          <w:i w:val="0"/>
+          <w:sz w:val="19"/>
+        </w:rPr>
+        <w:t>· con Shimada Yuta (colleghi): En suo verso l'altro 1 · in risposta 1</w:t>
+      </w:r>
+    </w:p>
+    <w:p>
+      <w:pPr>
         <w:spacing w:before="100" w:after="40"/>
       </w:pPr>
       <w:r>
@@ -2209,6 +2667,14 @@
           <w:sz w:val="23"/>
         </w:rPr>
         <w:t xml:space="preserve">  石田 和彦</w:t>
+      </w:r>
+      <w:r>
+        <w:rPr>
+          <w:i/>
+          <w:color w:val="706A5E"/>
+          <w:sz w:val="20"/>
+        </w:rPr>
+        <w:t xml:space="preserve">   IL TITOLARE dello SnakUp — testimone (ha paura)</w:t>
       </w:r>
     </w:p>
     <w:p>
@@ -2374,6 +2840,90 @@
     </w:tbl>
     <w:p>
       <w:pPr>
+        <w:spacing w:after="40" w:before="120"/>
+      </w:pPr>
+      <w:r>
+        <w:rPr>
+          <w:b/>
+          <w:i w:val="0"/>
+          <w:color w:val="B49650"/>
+          <w:sz w:val="19"/>
+        </w:rPr>
+        <w:t>Nella storia (verità del GM)</w:t>
+      </w:r>
+    </w:p>
+    <w:p>
+      <w:pPr>
+        <w:spacing w:after="20" w:before="0"/>
+        <w:ind w:left="283"/>
+      </w:pPr>
+      <w:r>
+        <w:rPr>
+          <w:b w:val="0"/>
+          <w:i w:val="0"/>
+          <w:sz w:val="19"/>
+        </w:rPr>
+        <w:t>· 1997-05-24 21:14 · SnakUp — La banda al completo arriva sul lavoro della vittima, con scuse, cosi diranno i testimoni, attaccano briga con la vittima che viene uccisa con un colpo alle spalle con un oggetto contundente. Se mostrate le foto vengono riconosciuti dal collega e dal titolare ma il titolare non collaborano subito ha paura di ritorsioni, la dipendente dice che era nel retro ed è rientrata in sala solo dopo il colpo; in realtà era in sala e ha visto tutto.</w:t>
+      </w:r>
+    </w:p>
+    <w:p>
+      <w:pPr>
+        <w:spacing w:after="40" w:before="120"/>
+      </w:pPr>
+      <w:r>
+        <w:rPr>
+          <w:b/>
+          <w:i w:val="0"/>
+          <w:color w:val="B49650"/>
+          <w:sz w:val="19"/>
+        </w:rPr>
+        <w:t>Cosa può dare ai PG</w:t>
+      </w:r>
+    </w:p>
+    <w:p>
+      <w:pPr>
+        <w:spacing w:after="20" w:before="0"/>
+        <w:ind w:left="283"/>
+      </w:pPr>
+      <w:r>
+        <w:rPr>
+          <w:b w:val="0"/>
+          <w:i w:val="0"/>
+          <w:sz w:val="19"/>
+        </w:rPr>
+        <w:t>· «Honda CBX400F» (interrogandolo): Descrive le moto ma non le conosce</w:t>
+      </w:r>
+    </w:p>
+    <w:p>
+      <w:pPr>
+        <w:spacing w:after="40" w:before="120"/>
+      </w:pPr>
+      <w:r>
+        <w:rPr>
+          <w:b/>
+          <w:i w:val="0"/>
+          <w:color w:val="B49650"/>
+          <w:sz w:val="19"/>
+        </w:rPr>
+        <w:t>I suoi legami (En)</w:t>
+      </w:r>
+    </w:p>
+    <w:p>
+      <w:pPr>
+        <w:spacing w:after="20" w:before="0"/>
+        <w:ind w:left="283"/>
+      </w:pPr>
+      <w:r>
+        <w:rPr>
+          <w:b w:val="0"/>
+          <w:i w:val="0"/>
+          <w:sz w:val="19"/>
+        </w:rPr>
+        <w:t>· con Shimada Yuta (capo e sottoposto): En suo verso l'altro -1 · in risposta 1</w:t>
+      </w:r>
+    </w:p>
+    <w:p>
+      <w:pPr>
         <w:spacing w:before="100" w:after="40"/>
       </w:pPr>
       <w:r>
@@ -2501,6 +3051,14 @@
           <w:sz w:val="23"/>
         </w:rPr>
         <w:t xml:space="preserve">  島田 康弘</w:t>
+      </w:r>
+      <w:r>
+        <w:rPr>
+          <w:i/>
+          <w:color w:val="706A5E"/>
+          <w:sz w:val="20"/>
+        </w:rPr>
+        <w:t xml:space="preserve">   LA MADRE della vittima</w:t>
       </w:r>
     </w:p>
     <w:p>
@@ -2708,6 +3266,48 @@
     </w:tbl>
     <w:p>
       <w:pPr>
+        <w:spacing w:after="40" w:before="120"/>
+      </w:pPr>
+      <w:r>
+        <w:rPr>
+          <w:b/>
+          <w:i w:val="0"/>
+          <w:color w:val="B49650"/>
+          <w:sz w:val="19"/>
+        </w:rPr>
+        <w:t>I suoi legami (En)</w:t>
+      </w:r>
+    </w:p>
+    <w:p>
+      <w:pPr>
+        <w:spacing w:after="20" w:before="0"/>
+        <w:ind w:left="283"/>
+      </w:pPr>
+      <w:r>
+        <w:rPr>
+          <w:b w:val="0"/>
+          <w:i w:val="0"/>
+          <w:sz w:val="19"/>
+        </w:rPr>
+        <w:t>· con Shimada Yuta (madre e figlio): En suo verso l'altro 4 · in risposta 3</w:t>
+      </w:r>
+    </w:p>
+    <w:p>
+      <w:pPr>
+        <w:spacing w:after="20" w:before="0"/>
+        <w:ind w:left="283"/>
+      </w:pPr>
+      <w:r>
+        <w:rPr>
+          <w:b w:val="0"/>
+          <w:i w:val="0"/>
+          <w:sz w:val="19"/>
+        </w:rPr>
+        <w:t>· con Aoki Hideki: En suo verso l'altro 1 · in risposta 0</w:t>
+      </w:r>
+    </w:p>
+    <w:p>
+      <w:pPr>
         <w:spacing w:before="100" w:after="40"/>
       </w:pPr>
       <w:r>
@@ -2863,6 +3463,14 @@
           <w:sz w:val="23"/>
         </w:rPr>
         <w:t xml:space="preserve">  島田 由美子</w:t>
+      </w:r>
+      <w:r>
+        <w:rPr>
+          <w:i/>
+          <w:color w:val="706A5E"/>
+          <w:sz w:val="20"/>
+        </w:rPr>
+        <w:t xml:space="preserve">   LA SORELLA della vittima</w:t>
       </w:r>
     </w:p>
     <w:p>
@@ -3277,6 +3885,34 @@
     </w:tbl>
     <w:p>
       <w:pPr>
+        <w:spacing w:after="40" w:before="120"/>
+      </w:pPr>
+      <w:r>
+        <w:rPr>
+          <w:b/>
+          <w:i w:val="0"/>
+          <w:color w:val="B49650"/>
+          <w:sz w:val="19"/>
+        </w:rPr>
+        <w:t>I suoi legami (En)</w:t>
+      </w:r>
+    </w:p>
+    <w:p>
+      <w:pPr>
+        <w:spacing w:after="20" w:before="0"/>
+        <w:ind w:left="283"/>
+      </w:pPr>
+      <w:r>
+        <w:rPr>
+          <w:b w:val="0"/>
+          <w:i w:val="0"/>
+          <w:sz w:val="19"/>
+        </w:rPr>
+        <w:t>· con Shimada Yuta (fratelli): En suo verso l'altro 4 · in risposta 4</w:t>
+      </w:r>
+    </w:p>
+    <w:p>
+      <w:pPr>
         <w:spacing w:before="100" w:after="40"/>
       </w:pPr>
       <w:r>
@@ -3405,6 +4041,14 @@
         </w:rPr>
         <w:t xml:space="preserve">  杉本 秀樹</w:t>
       </w:r>
+      <w:r>
+        <w:rPr>
+          <w:i/>
+          <w:color w:val="706A5E"/>
+          <w:sz w:val="20"/>
+        </w:rPr>
+        <w:t xml:space="preserve">   IL BRACCIO DESTRO di Matsui — ha pedinato i due</w:t>
+      </w:r>
     </w:p>
     <w:p>
       <w:pPr>
@@ -3464,17 +4108,142 @@
     </w:p>
     <w:p>
       <w:pPr>
-        <w:spacing w:after="40" w:before="0"/>
+        <w:spacing w:after="40" w:before="120"/>
+      </w:pPr>
+      <w:r>
+        <w:rPr>
+          <w:b/>
+          <w:i w:val="0"/>
+          <w:color w:val="B49650"/>
+          <w:sz w:val="19"/>
+        </w:rPr>
+        <w:t>Nella storia (verità del GM)</w:t>
+      </w:r>
+    </w:p>
+    <w:p>
+      <w:pPr>
+        <w:spacing w:after="20" w:before="0"/>
+        <w:ind w:left="283"/>
+      </w:pPr>
+      <w:r>
+        <w:rPr>
+          <w:b w:val="0"/>
+          <w:i w:val="0"/>
+          <w:sz w:val="19"/>
+        </w:rPr>
+        <w:t>· 1997-05-11 11:04 · Sede Banda — Tanaka Takayuki avvisa il capo Matsui Kenta, che incarica il suo braccio destro Sugimoto Hideki di indagare i due.</w:t>
+      </w:r>
+    </w:p>
+    <w:p>
+      <w:pPr>
+        <w:spacing w:after="20" w:before="0"/>
+        <w:ind w:left="283"/>
+      </w:pPr>
+      <w:r>
+        <w:rPr>
+          <w:b w:val="0"/>
+          <w:i w:val="0"/>
+          <w:sz w:val="19"/>
+        </w:rPr>
+        <w:t>· 1997-05-15 11:14 — Suzuki Nobuyuki ferma per un controllo Sugimoto Hideki per un controllo, capisce che sta seguendo qualcuno perchè continua a guardarsi intorno</w:t>
+      </w:r>
+    </w:p>
+    <w:p>
+      <w:pPr>
+        <w:spacing w:after="20" w:before="0"/>
+        <w:ind w:left="283"/>
+      </w:pPr>
+      <w:r>
+        <w:rPr>
+          <w:b w:val="0"/>
+          <w:i w:val="0"/>
+          <w:sz w:val="19"/>
+        </w:rPr>
+        <w:t>· 1997-05-24 21:14 · SnakUp — La banda al completo arriva sul lavoro della vittima, con scuse, cosi diranno i testimoni, attaccano briga con la vittima che viene uccisa con un colpo alle spalle con un oggetto contundente. Se mostrate le foto vengono riconosciuti dal collega e dal titolare ma il titolare non collaborano subito ha paura di ritorsioni, la dipendente dice che era nel retro ed è rientrata in sala solo dopo il colpo; in realtà era in sala e ha visto tutto.</w:t>
+      </w:r>
+    </w:p>
+    <w:p>
+      <w:pPr>
+        <w:spacing w:after="40" w:before="120"/>
+      </w:pPr>
+      <w:r>
+        <w:rPr>
+          <w:b/>
+          <w:i w:val="0"/>
+          <w:color w:val="B49650"/>
+          <w:sz w:val="19"/>
+        </w:rPr>
+        <w:t>La sua deposizione</w:t>
+      </w:r>
+    </w:p>
+    <w:p>
+      <w:pPr>
+        <w:spacing w:after="60" w:before="0"/>
         <w:ind w:left="227"/>
       </w:pPr>
       <w:r>
         <w:rPr>
           <w:b w:val="0"/>
           <w:i/>
-          <w:color w:val="8B1A1A"/>
-          <w:sz w:val="19"/>
-        </w:rPr>
-        <w:t>Scheda non compilata: manca cosa sa, come si comporta e la deposizione. Al tavolo si improvvisa.</w:t>
+          <w:sz w:val="20"/>
+        </w:rPr>
+        <w:t>Sugimoto. Ventiquattro. Il lavoro va e viene.</w:t>
+      </w:r>
+    </w:p>
+    <w:p>
+      <w:pPr>
+        <w:spacing w:after="60" w:before="0"/>
+        <w:ind w:left="227"/>
+      </w:pPr>
+      <w:r>
+        <w:rPr>
+          <w:b w:val="0"/>
+          <w:i/>
+          <w:sz w:val="20"/>
+        </w:rPr>
+        <w:t>Sabato sera? In giro con le moto, come sempre. Dove, di preciso, non me lo ricordo: si gira. Con chi? Amici. I nomi non li faccio, non c'è motivo.</w:t>
+      </w:r>
+    </w:p>
+    <w:p>
+      <w:pPr>
+        <w:spacing w:after="60" w:before="0"/>
+        <w:ind w:left="227"/>
+      </w:pPr>
+      <w:r>
+        <w:rPr>
+          <w:b w:val="0"/>
+          <w:i/>
+          <w:sz w:val="20"/>
+        </w:rPr>
+        <w:t>Kenta lo conosco, sì. Amici. «Capo» lo dice lei — noi giriamo in moto, punto. Lo snack non so nemmeno dove sia.</w:t>
+      </w:r>
+    </w:p>
+    <w:p>
+      <w:pPr>
+        <w:spacing w:after="60" w:before="0"/>
+        <w:ind w:left="227"/>
+      </w:pPr>
+      <w:r>
+        <w:rPr>
+          <w:b w:val="0"/>
+          <w:i/>
+          <w:sz w:val="20"/>
+        </w:rPr>
+        <w:t>Il controllo del quindici? Un poliziotto che non aveva niente da fare. Guardavo le vetrine. Non è reato.</w:t>
+      </w:r>
+    </w:p>
+    <w:p>
+      <w:pPr>
+        <w:spacing w:after="60" w:before="0"/>
+        <w:ind w:left="227"/>
+      </w:pPr>
+      <w:r>
+        <w:rPr>
+          <w:b w:val="0"/>
+          <w:i/>
+          <w:sz w:val="20"/>
+        </w:rPr>
+        <w:t>Se avete altro, parlate col mio avvocato. Se non ce l'avete, ho da fare.</w:t>
       </w:r>
     </w:p>
     <w:p>
@@ -3510,6 +4279,14 @@
         </w:rPr>
         <w:t xml:space="preserve">  鈴木 信之</w:t>
       </w:r>
+      <w:r>
+        <w:rPr>
+          <w:i/>
+          <w:color w:val="706A5E"/>
+          <w:sz w:val="20"/>
+        </w:rPr>
+        <w:t xml:space="preserve">   IL CAPO DEL KŌBAN di Kamigyō — rivale della banda</w:t>
+      </w:r>
     </w:p>
     <w:p>
       <w:pPr>
@@ -3555,32 +4332,240 @@
     </w:p>
     <w:p>
       <w:pPr>
-        <w:spacing w:after="40" w:before="80"/>
-        <w:ind w:left="227"/>
+        <w:spacing w:after="40" w:before="120"/>
+      </w:pPr>
+      <w:r>
+        <w:rPr>
+          <w:b/>
+          <w:i w:val="0"/>
+          <w:color w:val="B49650"/>
+          <w:sz w:val="19"/>
+        </w:rPr>
+        <w:t>Dove si trova</w:t>
+      </w:r>
+    </w:p>
+    <w:tbl>
+      <w:tblPr>
+        <w:tblW w:type="auto" w:w="0"/>
+        <w:jc w:val="left"/>
+        <w:tblLayout w:type="fixed"/>
+        <w:tblLook w:firstColumn="1" w:firstRow="1" w:lastColumn="0" w:lastRow="0" w:noHBand="0" w:noVBand="1" w:val="04A0"/>
+        <w:tblLayout w:type="fixed"/>
+      </w:tblPr>
+      <w:tblGrid>
+        <w:gridCol w:w="4933"/>
+        <w:gridCol w:w="4933"/>
+      </w:tblGrid>
+      <w:tr>
+        <w:tc>
+          <w:tcPr>
+            <w:tcW w:type="dxa" w:w="1928"/>
+          </w:tcPr>
+          <w:p>
+            <w:pPr>
+              <w:spacing w:after="20"/>
+            </w:pPr>
+            <w:r>
+              <w:rPr>
+                <w:b/>
+                <w:color w:val="706A5E"/>
+                <w:sz w:val="19"/>
+              </w:rPr>
+              <w:t>Luoghi suoi</w:t>
+            </w:r>
+          </w:p>
+        </w:tc>
+        <w:tc>
+          <w:tcPr>
+            <w:tcW w:type="dxa" w:w="7710"/>
+          </w:tcPr>
+          <w:p>
+            <w:pPr>
+              <w:spacing w:after="20"/>
+            </w:pPr>
+            <w:r>
+              <w:rPr>
+                <w:sz w:val="20"/>
+              </w:rPr>
+              <w:t>Sede Banda</w:t>
+            </w:r>
+          </w:p>
+        </w:tc>
+      </w:tr>
+    </w:tbl>
+    <w:p>
+      <w:pPr>
+        <w:spacing w:after="40" w:before="120"/>
+      </w:pPr>
+      <w:r>
+        <w:rPr>
+          <w:b/>
+          <w:i w:val="0"/>
+          <w:color w:val="B49650"/>
+          <w:sz w:val="19"/>
+        </w:rPr>
+        <w:t>Nella storia (verità del GM)</w:t>
+      </w:r>
+    </w:p>
+    <w:p>
+      <w:pPr>
+        <w:spacing w:after="20" w:before="0"/>
+        <w:ind w:left="283"/>
       </w:pPr>
       <w:r>
         <w:rPr>
           <w:b w:val="0"/>
           <w:i w:val="0"/>
-          <w:color w:val="706A5E"/>
           <w:sz w:val="19"/>
         </w:rPr>
-        <w:t>Luoghi suoi: Sede Banda</w:t>
-      </w:r>
-    </w:p>
-    <w:p>
-      <w:pPr>
-        <w:spacing w:after="40" w:before="0"/>
+        <w:t>· 1997-05-15 11:14 — Suzuki Nobuyuki ferma per un controllo Sugimoto Hideki per un controllo, capisce che sta seguendo qualcuno perchè continua a guardarsi intorno</w:t>
+      </w:r>
+    </w:p>
+    <w:p>
+      <w:pPr>
+        <w:spacing w:after="40" w:before="120"/>
+      </w:pPr>
+      <w:r>
+        <w:rPr>
+          <w:b/>
+          <w:i w:val="0"/>
+          <w:color w:val="B49650"/>
+          <w:sz w:val="19"/>
+        </w:rPr>
+        <w:t>Cosa può dare ai PG</w:t>
+      </w:r>
+    </w:p>
+    <w:p>
+      <w:pPr>
+        <w:spacing w:after="20" w:before="0"/>
+        <w:ind w:left="283"/>
+      </w:pPr>
+      <w:r>
+        <w:rPr>
+          <w:b w:val="0"/>
+          <w:i w:val="0"/>
+          <w:sz w:val="19"/>
+        </w:rPr>
+        <w:t>· «Honda CBX400F» (con richiesta all'ente): KŌBAN DI KAMIGYŌ — Riscontro alla richiesta del Distretto di Shimogyō (procedimento Shimada).</w:t>
+        <w:br/>
+        <w:br/>
+        <w:t>Le due motociclette segnalate — Honda CBX400F, livrea bianco-rossa «tricolor», targa piegata verso l'alto, sella a tre gradini con schienalone cromato, scarichi takeyari smarmittati — corrispondono a due esemplari ben noti a questo posto di polizia: appartengono al gruppo di motociclisti (bōsōzoku) che fa capo a MATSUI Kenta, responsabile in zona di schiamazzi notturni, gare su strada e danneggiamenti. Si allega fotografia di polizia del suddetto.</w:t>
+        <w:br/>
+        <w:br/>
+        <w:t>Il gruppo conta quattro-cinque elementi stabili. Si segnala inoltre che l'elemento di spicco SUGIMOTO Hideki (anni 24) è stato sottoposto a controllo dal sottoscritto in data 15 maggio u.s., in Kamigyō: si guardava attorno con insistenza, come chi segue qualcuno; nulla da contestare al momento del controllo.</w:t>
+        <w:br/>
+        <w:br/>
+        <w:t>Per l'ubicazione del ritrovo abituale del gruppo, questo ufficio può fornire riscontro su richiesta specifica.</w:t>
+        <w:br/>
+        <w:br/>
+        <w:t>Il capo posto — SUZUKI Nobuyuki 鈴木 信之 — diventa handout: «Fascicolo CBX400F — Kōban di Kamigyō»</w:t>
+      </w:r>
+    </w:p>
+    <w:p>
+      <w:pPr>
+        <w:spacing w:after="20" w:before="0"/>
+        <w:ind w:left="283"/>
+      </w:pPr>
+      <w:r>
+        <w:rPr>
+          <w:b w:val="0"/>
+          <w:i w:val="0"/>
+          <w:sz w:val="19"/>
+        </w:rPr>
+        <w:t>· «Magazzino covo banda» (con richiesta all'ente): KŌBAN DI KAMIGYŌ — Riscontro alla richiesta relativa al luogo di ritrovo del gruppo di MATSUI Kenta.</w:t>
+        <w:br/>
+        <w:br/>
+        <w:t>Da appostamenti di questo ufficio e da segnalazioni ripetute dei residenti (motori a tarda notte), il gruppo dispone in uso stabile di un capannone tra i capannoni industriali di Murasakino, Kita-ku: una ex fabbrica con cortile di carico e guardiola sull'ingresso. Le due CBX400F vi sono state viste rientrare più volte, anche nelle ultime settimane.</w:t>
+        <w:br/>
+        <w:br/>
+        <w:t>Si allega planimetria di massima. Si raccomanda prudenza: il gruppo non ha mai mostrato disponibilità al dialogo con questo ufficio.</w:t>
+        <w:br/>
+        <w:br/>
+        <w:t>Il capo posto — SUZUKI Nobuyuki 鈴木 信之 — diventa handout: «Magazzino — Kōban di Kamigyō»</w:t>
+      </w:r>
+    </w:p>
+    <w:p>
+      <w:pPr>
+        <w:spacing w:after="40" w:before="120"/>
+      </w:pPr>
+      <w:r>
+        <w:rPr>
+          <w:b/>
+          <w:i w:val="0"/>
+          <w:color w:val="B49650"/>
+          <w:sz w:val="19"/>
+        </w:rPr>
+        <w:t>La sua deposizione</w:t>
+      </w:r>
+    </w:p>
+    <w:p>
+      <w:pPr>
+        <w:spacing w:after="60" w:before="0"/>
         <w:ind w:left="227"/>
       </w:pPr>
       <w:r>
         <w:rPr>
           <w:b w:val="0"/>
           <w:i/>
-          <w:color w:val="8B1A1A"/>
-          <w:sz w:val="19"/>
-        </w:rPr>
-        <w:t>Scheda non compilata: manca cosa sa, come si comporta e la deposizione. Al tavolo si improvvisa.</w:t>
+          <w:sz w:val="20"/>
+        </w:rPr>
+        <w:t>Suzuki Nobuyuki, capoposto del kōban di Kamigyō. Ventitré anni di servizio.</w:t>
+      </w:r>
+    </w:p>
+    <w:p>
+      <w:pPr>
+        <w:spacing w:after="60" w:before="0"/>
+        <w:ind w:left="227"/>
+      </w:pPr>
+      <w:r>
+        <w:rPr>
+          <w:b w:val="0"/>
+          <w:i/>
+          <w:sz w:val="20"/>
+        </w:rPr>
+        <w:t>Il gruppo lo conosciamo bene: moto truccate, schiamazzi, gare notturne, qualche vetrina rotta. Il capo è Matsui Kenta — un ragazzo convinto d'essere più grosso di quel che è. Con noi, solo provocazioni: mai un dialogo.</w:t>
+      </w:r>
+    </w:p>
+    <w:p>
+      <w:pPr>
+        <w:spacing w:after="60" w:before="0"/>
+        <w:ind w:left="227"/>
+      </w:pPr>
+      <w:r>
+        <w:rPr>
+          <w:b w:val="0"/>
+          <w:i/>
+          <w:sz w:val="20"/>
+        </w:rPr>
+        <w:t>Il quindici maggio ho fermato Sugimoto Hideki, il suo braccio destro, qui in zona: si guardava attorno con troppa attenzione, come chi segue qualcuno. Addosso niente, e l'ho annotato. Col senno di poi, avrei dovuto capirci di più.</w:t>
+      </w:r>
+    </w:p>
+    <w:p>
+      <w:pPr>
+        <w:spacing w:after="60" w:before="0"/>
+        <w:ind w:left="227"/>
+      </w:pPr>
+      <w:r>
+        <w:rPr>
+          <w:b w:val="0"/>
+          <w:i/>
+          <w:sz w:val="20"/>
+        </w:rPr>
+        <w:t>Le due CBX400F sono inconfondibili: livrea bianco-rossa, schienaloni, scarichi a canna lunga. Le vediamo rientrare verso i capannoni di Murasakino, a Kita.</w:t>
+      </w:r>
+    </w:p>
+    <w:p>
+      <w:pPr>
+        <w:spacing w:after="60" w:before="0"/>
+        <w:ind w:left="227"/>
+      </w:pPr>
+      <w:r>
+        <w:rPr>
+          <w:b w:val="0"/>
+          <w:i/>
+          <w:sz w:val="20"/>
+        </w:rPr>
+        <w:t>Quello che serve al distretto, questo ufficio lo mette a disposizione. Anche il sottoscritto.</w:t>
       </w:r>
     </w:p>
     <w:p>
@@ -3616,6 +4601,14 @@
         </w:rPr>
         <w:t xml:space="preserve">  田中 隆行</w:t>
       </w:r>
+      <w:r>
+        <w:rPr>
+          <w:i/>
+          <w:color w:val="706A5E"/>
+          <w:sz w:val="20"/>
+        </w:rPr>
+        <w:t xml:space="preserve">   GREGARIO della banda — quello che ha fatto la spia</w:t>
+      </w:r>
     </w:p>
     <w:p>
       <w:pPr>
@@ -3661,17 +4654,142 @@
     </w:p>
     <w:p>
       <w:pPr>
-        <w:spacing w:after="40" w:before="0"/>
+        <w:spacing w:after="40" w:before="120"/>
+      </w:pPr>
+      <w:r>
+        <w:rPr>
+          <w:b/>
+          <w:i w:val="0"/>
+          <w:color w:val="B49650"/>
+          <w:sz w:val="19"/>
+        </w:rPr>
+        <w:t>Nella storia (verità del GM)</w:t>
+      </w:r>
+    </w:p>
+    <w:p>
+      <w:pPr>
+        <w:spacing w:after="20" w:before="0"/>
+        <w:ind w:left="283"/>
+      </w:pPr>
+      <w:r>
+        <w:rPr>
+          <w:b w:val="0"/>
+          <w:i w:val="0"/>
+          <w:sz w:val="19"/>
+        </w:rPr>
+        <w:t>· 1997-05-10 20:00 — Escono insieme e vengono visti da uno della banda</w:t>
+      </w:r>
+    </w:p>
+    <w:p>
+      <w:pPr>
+        <w:spacing w:after="20" w:before="0"/>
+        <w:ind w:left="283"/>
+      </w:pPr>
+      <w:r>
+        <w:rPr>
+          <w:b w:val="0"/>
+          <w:i w:val="0"/>
+          <w:sz w:val="19"/>
+        </w:rPr>
+        <w:t>· 1997-05-11 11:04 · Sede Banda — Tanaka Takayuki avvisa il capo Matsui Kenta, che incarica il suo braccio destro Sugimoto Hideki di indagare i due.</w:t>
+      </w:r>
+    </w:p>
+    <w:p>
+      <w:pPr>
+        <w:spacing w:after="20" w:before="0"/>
+        <w:ind w:left="283"/>
+      </w:pPr>
+      <w:r>
+        <w:rPr>
+          <w:b w:val="0"/>
+          <w:i w:val="0"/>
+          <w:sz w:val="19"/>
+        </w:rPr>
+        <w:t>· 1997-05-24 21:14 · SnakUp — La banda al completo arriva sul lavoro della vittima, con scuse, cosi diranno i testimoni, attaccano briga con la vittima che viene uccisa con un colpo alle spalle con un oggetto contundente. Se mostrate le foto vengono riconosciuti dal collega e dal titolare ma il titolare non collaborano subito ha paura di ritorsioni, la dipendente dice che era nel retro ed è rientrata in sala solo dopo il colpo; in realtà era in sala e ha visto tutto.</w:t>
+      </w:r>
+    </w:p>
+    <w:p>
+      <w:pPr>
+        <w:spacing w:after="40" w:before="120"/>
+      </w:pPr>
+      <w:r>
+        <w:rPr>
+          <w:b/>
+          <w:i w:val="0"/>
+          <w:color w:val="B49650"/>
+          <w:sz w:val="19"/>
+        </w:rPr>
+        <w:t>La sua deposizione</w:t>
+      </w:r>
+    </w:p>
+    <w:p>
+      <w:pPr>
+        <w:spacing w:after="60" w:before="0"/>
         <w:ind w:left="227"/>
       </w:pPr>
       <w:r>
         <w:rPr>
           <w:b w:val="0"/>
           <w:i/>
-          <w:color w:val="8B1A1A"/>
-          <w:sz w:val="19"/>
-        </w:rPr>
-        <w:t>Scheda non compilata: manca cosa sa, come si comporta e la deposizione. Al tavolo si improvvisa.</w:t>
+          <w:sz w:val="20"/>
+        </w:rPr>
+        <w:t>Tanaka Takayuki, ventidue. Lavoretti, officina quando c'è.</w:t>
+      </w:r>
+    </w:p>
+    <w:p>
+      <w:pPr>
+        <w:spacing w:after="60" w:before="0"/>
+        <w:ind w:left="227"/>
+      </w:pPr>
+      <w:r>
+        <w:rPr>
+          <w:b w:val="0"/>
+          <w:i/>
+          <w:sz w:val="20"/>
+        </w:rPr>
+        <w:t>Sabato stavo con gli altri, in giro. Verso Shimogyō? Può darsi, le strade sono di tutti. Nel locale non sono entrato — cioè, non mi ricordo. C'era casino, saranno stati altri.</w:t>
+      </w:r>
+    </w:p>
+    <w:p>
+      <w:pPr>
+        <w:spacing w:after="60" w:before="0"/>
+        <w:ind w:left="227"/>
+      </w:pPr>
+      <w:r>
+        <w:rPr>
+          <w:b w:val="0"/>
+          <w:i/>
+          <w:sz w:val="20"/>
+        </w:rPr>
+        <w:t>La ragazza di Kenta? Ex, guardi. Ex. Quella si è messa con uno studentello, lo sanno tutti... cioè, lo dicono. Io che ne so. Io non ho detto niente a nessuno.</w:t>
+      </w:r>
+    </w:p>
+    <w:p>
+      <w:pPr>
+        <w:spacing w:after="60" w:before="0"/>
+        <w:ind w:left="227"/>
+      </w:pPr>
+      <w:r>
+        <w:rPr>
+          <w:b w:val="0"/>
+          <w:i/>
+          <w:sz w:val="20"/>
+        </w:rPr>
+        <w:t>No, «l'ho vista io per primo» non l'ho mai detto. Chi gliel'ha raccontato? Yukio? Quello parla e non sa niente.</w:t>
+      </w:r>
+    </w:p>
+    <w:p>
+      <w:pPr>
+        <w:spacing w:after="60" w:before="0"/>
+        <w:ind w:left="227"/>
+      </w:pPr>
+      <w:r>
+        <w:rPr>
+          <w:b w:val="0"/>
+          <w:i/>
+          <w:sz w:val="20"/>
+        </w:rPr>
+        <w:t>Posso andare? Ho la moto in divieto.</w:t>
       </w:r>
     </w:p>
     <w:p>
@@ -3706,6 +4824,14 @@
           <w:sz w:val="23"/>
         </w:rPr>
         <w:t xml:space="preserve">  渡辺 紀子</w:t>
+      </w:r>
+      <w:r>
+        <w:rPr>
+          <w:i/>
+          <w:color w:val="706A5E"/>
+          <w:sz w:val="20"/>
+        </w:rPr>
+        <w:t xml:space="preserve">   LA RAGAZZA — contesa: ex di Matsui, innamorata di Yuta</w:t>
       </w:r>
     </w:p>
     <w:p>
@@ -4190,6 +5316,118 @@
     </w:tbl>
     <w:p>
       <w:pPr>
+        <w:spacing w:after="40" w:before="120"/>
+      </w:pPr>
+      <w:r>
+        <w:rPr>
+          <w:b/>
+          <w:i w:val="0"/>
+          <w:color w:val="B49650"/>
+          <w:sz w:val="19"/>
+        </w:rPr>
+        <w:t>Nella storia (verità del GM)</w:t>
+      </w:r>
+    </w:p>
+    <w:p>
+      <w:pPr>
+        <w:spacing w:after="20" w:before="0"/>
+        <w:ind w:left="283"/>
+      </w:pPr>
+      <w:r>
+        <w:rPr>
+          <w:b w:val="0"/>
+          <w:i w:val="0"/>
+          <w:sz w:val="19"/>
+        </w:rPr>
+        <w:t>· 1997-04-25 19:25 · SnakUp — Si incontrano dove lavora Shimada Yuta, tra loro scoppia compicità</w:t>
+      </w:r>
+    </w:p>
+    <w:p>
+      <w:pPr>
+        <w:spacing w:after="20" w:before="0"/>
+        <w:ind w:left="283"/>
+      </w:pPr>
+      <w:r>
+        <w:rPr>
+          <w:b w:val="0"/>
+          <w:i w:val="0"/>
+          <w:sz w:val="19"/>
+        </w:rPr>
+        <w:t>· 1997-05-10 20:00 — Escono insieme e vengono visti da uno della banda</w:t>
+      </w:r>
+    </w:p>
+    <w:p>
+      <w:pPr>
+        <w:spacing w:after="40" w:before="120"/>
+      </w:pPr>
+      <w:r>
+        <w:rPr>
+          <w:b/>
+          <w:i w:val="0"/>
+          <w:color w:val="B49650"/>
+          <w:sz w:val="19"/>
+        </w:rPr>
+        <w:t>Cosa può dare ai PG</w:t>
+      </w:r>
+    </w:p>
+    <w:p>
+      <w:pPr>
+        <w:spacing w:after="20" w:before="0"/>
+        <w:ind w:left="283"/>
+      </w:pPr>
+      <w:r>
+        <w:rPr>
+          <w:b w:val="0"/>
+          <w:i w:val="0"/>
+          <w:sz w:val="19"/>
+        </w:rPr>
+        <w:t>· «Magazzino covo banda» (interrogandolo): Sa solo la zona: i capannoni di Murasakino, a Kita-ku. Il posto esatto non lo conosce — dentro non c'è mai stata.</w:t>
+      </w:r>
+    </w:p>
+    <w:p>
+      <w:pPr>
+        <w:spacing w:after="40" w:before="120"/>
+      </w:pPr>
+      <w:r>
+        <w:rPr>
+          <w:b/>
+          <w:i w:val="0"/>
+          <w:color w:val="B49650"/>
+          <w:sz w:val="19"/>
+        </w:rPr>
+        <w:t>I suoi legami (En)</w:t>
+      </w:r>
+    </w:p>
+    <w:p>
+      <w:pPr>
+        <w:spacing w:after="20" w:before="0"/>
+        <w:ind w:left="283"/>
+      </w:pPr>
+      <w:r>
+        <w:rPr>
+          <w:b w:val="0"/>
+          <w:i w:val="0"/>
+          <w:sz w:val="19"/>
+        </w:rPr>
+        <w:t>· con Shimada Yuta (fidanzati): En suo verso l'altro 4 · in risposta 5</w:t>
+      </w:r>
+    </w:p>
+    <w:p>
+      <w:pPr>
+        <w:spacing w:after="20" w:before="0"/>
+        <w:ind w:left="283"/>
+      </w:pPr>
+      <w:r>
+        <w:rPr>
+          <w:b w:val="0"/>
+          <w:i w:val="0"/>
+          <w:sz w:val="19"/>
+        </w:rPr>
+        <w:t>· con Matsui Kenta (ex fidanzati): En suo verso l'altro 2 · in risposta 5</w:t>
+      </w:r>
+    </w:p>
+    <w:p>
+      <w:pPr>
         <w:spacing w:before="100" w:after="40"/>
       </w:pPr>
       <w:r>
@@ -4360,6 +5598,14 @@
         </w:rPr>
         <w:t xml:space="preserve">  吉田 幸雄</w:t>
       </w:r>
+      <w:r>
+        <w:rPr>
+          <w:i/>
+          <w:color w:val="706A5E"/>
+          <w:sz w:val="20"/>
+        </w:rPr>
+        <w:t xml:space="preserve">   GREGARIO della banda — il più giovane, l'anello debole</w:t>
+      </w:r>
     </w:p>
     <w:p>
       <w:pPr>
@@ -4405,17 +5651,114 @@
     </w:p>
     <w:p>
       <w:pPr>
-        <w:spacing w:after="40" w:before="0"/>
+        <w:spacing w:after="40" w:before="120"/>
+      </w:pPr>
+      <w:r>
+        <w:rPr>
+          <w:b/>
+          <w:i w:val="0"/>
+          <w:color w:val="B49650"/>
+          <w:sz w:val="19"/>
+        </w:rPr>
+        <w:t>Nella storia (verità del GM)</w:t>
+      </w:r>
+    </w:p>
+    <w:p>
+      <w:pPr>
+        <w:spacing w:after="20" w:before="0"/>
+        <w:ind w:left="283"/>
+      </w:pPr>
+      <w:r>
+        <w:rPr>
+          <w:b w:val="0"/>
+          <w:i w:val="0"/>
+          <w:sz w:val="19"/>
+        </w:rPr>
+        <w:t>· 1997-05-24 21:14 · SnakUp — La banda al completo arriva sul lavoro della vittima, con scuse, cosi diranno i testimoni, attaccano briga con la vittima che viene uccisa con un colpo alle spalle con un oggetto contundente. Se mostrate le foto vengono riconosciuti dal collega e dal titolare ma il titolare non collaborano subito ha paura di ritorsioni, la dipendente dice che era nel retro ed è rientrata in sala solo dopo il colpo; in realtà era in sala e ha visto tutto.</w:t>
+      </w:r>
+    </w:p>
+    <w:p>
+      <w:pPr>
+        <w:spacing w:after="40" w:before="120"/>
+      </w:pPr>
+      <w:r>
+        <w:rPr>
+          <w:b/>
+          <w:i w:val="0"/>
+          <w:color w:val="B49650"/>
+          <w:sz w:val="19"/>
+        </w:rPr>
+        <w:t>La sua deposizione</w:t>
+      </w:r>
+    </w:p>
+    <w:p>
+      <w:pPr>
+        <w:spacing w:after="60" w:before="0"/>
         <w:ind w:left="227"/>
       </w:pPr>
       <w:r>
         <w:rPr>
           <w:b w:val="0"/>
           <w:i/>
-          <w:color w:val="8B1A1A"/>
-          <w:sz w:val="19"/>
-        </w:rPr>
-        <w:t>Scheda non compilata: manca cosa sa, come si comporta e la deposizione. Al tavolo si improvvisa.</w:t>
+          <w:sz w:val="20"/>
+        </w:rPr>
+        <w:t>Yoshida... Yukio. Diciannove.</w:t>
+      </w:r>
+    </w:p>
+    <w:p>
+      <w:pPr>
+        <w:spacing w:after="60" w:before="0"/>
+        <w:ind w:left="227"/>
+      </w:pPr>
+      <w:r>
+        <w:rPr>
+          <w:b w:val="0"/>
+          <w:i/>
+          <w:sz w:val="20"/>
+        </w:rPr>
+        <w:t>Io... io stavo fuori, con le moto. Le tenevo accese, dovevamo solo passare, era... era una cosa veloce. Io dentro non ci sono entrato, giuro. Non ho visto niente, ho solo sentito... il casino. Poi siamo partiti.</w:t>
+      </w:r>
+    </w:p>
+    <w:p>
+      <w:pPr>
+        <w:spacing w:after="60" w:before="0"/>
+        <w:ind w:left="227"/>
+      </w:pPr>
+      <w:r>
+        <w:rPr>
+          <w:b w:val="0"/>
+          <w:i/>
+          <w:sz w:val="20"/>
+        </w:rPr>
+        <w:t>Chi c'era dentro non lo posso... non lo so. Non mi faccia questa domanda. Lei non li conosce.</w:t>
+      </w:r>
+    </w:p>
+    <w:p>
+      <w:pPr>
+        <w:spacing w:after="60" w:before="0"/>
+        <w:ind w:left="227"/>
+      </w:pPr>
+      <w:r>
+        <w:rPr>
+          <w:b w:val="0"/>
+          <w:i/>
+          <w:sz w:val="20"/>
+        </w:rPr>
+        <w:t>Il ragazzo del bar io non lo conoscevo, io no. Sta... è morto davvero?</w:t>
+      </w:r>
+    </w:p>
+    <w:p>
+      <w:pPr>
+        <w:spacing w:after="60" w:before="0"/>
+        <w:ind w:left="227"/>
+      </w:pPr>
+      <w:r>
+        <w:rPr>
+          <w:b w:val="0"/>
+          <w:i/>
+          <w:sz w:val="20"/>
+        </w:rPr>
+        <w:t>Posso avere dell'acqua? Se mio padre lo sa mi ammazza. [Se isolato dagli altri e trattato con calma: piange, e conferma tutto — chi è entrato, chi ha colpito, con cosa.]</w:t>
       </w:r>
     </w:p>
     <w:p>
@@ -4497,6 +5840,62 @@
     </w:p>
     <w:p>
       <w:pPr>
+        <w:spacing w:after="40" w:before="60"/>
+      </w:pPr>
+      <w:r>
+        <w:rPr>
+          <w:b/>
+          <w:i w:val="0"/>
+          <w:color w:val="B49650"/>
+          <w:sz w:val="19"/>
+        </w:rPr>
+        <w:t>Quando i PG arrivano</w:t>
+      </w:r>
+    </w:p>
+    <w:p>
+      <w:pPr>
+        <w:spacing w:after="40" w:before="0"/>
+        <w:ind w:left="227"/>
+      </w:pPr>
+      <w:r>
+        <w:rPr>
+          <w:b w:val="0"/>
+          <w:i/>
+          <w:sz w:val="20"/>
+        </w:rPr>
+        <w:t>Un mansion anni Ottanta a Nakagyō: citofono con le targhette, biciclette allineate, una portineria con il registro. Ai piani, corridoi tutti uguali e porte blindate tutte uguali: la vita che non si vede da fuori.</w:t>
+      </w:r>
+    </w:p>
+    <w:p>
+      <w:pPr>
+        <w:spacing w:after="40" w:before="60"/>
+      </w:pPr>
+      <w:r>
+        <w:rPr>
+          <w:b/>
+          <w:i w:val="0"/>
+          <w:color w:val="B49650"/>
+          <w:sz w:val="19"/>
+        </w:rPr>
+        <w:t>Quando entrano</w:t>
+      </w:r>
+    </w:p>
+    <w:p>
+      <w:pPr>
+        <w:spacing w:after="40" w:before="0"/>
+        <w:ind w:left="227"/>
+      </w:pPr>
+      <w:r>
+        <w:rPr>
+          <w:b w:val="0"/>
+          <w:i/>
+          <w:sz w:val="20"/>
+        </w:rPr>
+        <w:t>L'appartamento è piccolo e in ordine feroce, di quell'ordine che si fa quando non si sa cos'altro fare. Pantofole pronte per gli ospiti, incenso acceso, il tè versato che nessuno beve. La camera di Yuta è rimasta com'era: libri di medicina impilati, la scrivania pulita, il futon piegato. La madre siede con le mani in grembo; la sorella sta in piedi.</w:t>
+      </w:r>
+    </w:p>
+    <w:p>
+      <w:pPr>
         <w:spacing w:after="40"/>
         <w:ind w:left="227"/>
       </w:pPr>
@@ -4587,6 +5986,62 @@
     </w:p>
     <w:p>
       <w:pPr>
+        <w:spacing w:after="40" w:before="60"/>
+      </w:pPr>
+      <w:r>
+        <w:rPr>
+          <w:b/>
+          <w:i w:val="0"/>
+          <w:color w:val="B49650"/>
+          <w:sz w:val="19"/>
+        </w:rPr>
+        <w:t>Quando i PG arrivano</w:t>
+      </w:r>
+    </w:p>
+    <w:p>
+      <w:pPr>
+        <w:spacing w:after="40" w:before="0"/>
+        <w:ind w:left="227"/>
+      </w:pPr>
+      <w:r>
+        <w:rPr>
+          <w:b w:val="0"/>
+          <w:i/>
+          <w:sz w:val="20"/>
+        </w:rPr>
+        <w:t>Un vicolo stretto di Shimogyō, insegne a tubo fluorescente una sopra l'altra: lo SnakUp è una porta e una vetrina smerigliata, l'insegna spenta. Davanti, il nastro giallo della polizia e un agente in uniforme che sbadiglia; dalle saracinesche mezze alzate dei vicini, occhi che guardano e bocche che non sanno niente.</w:t>
+      </w:r>
+    </w:p>
+    <w:p>
+      <w:pPr>
+        <w:spacing w:after="40" w:before="60"/>
+      </w:pPr>
+      <w:r>
+        <w:rPr>
+          <w:b/>
+          <w:i w:val="0"/>
+          <w:color w:val="B49650"/>
+          <w:sz w:val="19"/>
+        </w:rPr>
+        <w:t>Quando entrano</w:t>
+      </w:r>
+    </w:p>
+    <w:p>
+      <w:pPr>
+        <w:spacing w:after="40" w:before="0"/>
+        <w:ind w:left="227"/>
+      </w:pPr>
+      <w:r>
+        <w:rPr>
+          <w:b w:val="0"/>
+          <w:i/>
+          <w:sz w:val="20"/>
+        </w:rPr>
+        <w:t>Dentro è piu' piccolo di quanto sembri: sei sgabelli, un bancone corto, il karaoke muto in un angolo. Sugli scaffali le bottiglie tenute coi nomi dei clienti scritti a pennarello. Odore di fumo freddo e detersivo; a terra, vicino al bancone, il segno di dove è caduto Shimada Yuta. Sotto la cassa, il quaderno dei conti a credito della clientela fissa.</w:t>
+      </w:r>
+    </w:p>
+    <w:p>
+      <w:pPr>
         <w:spacing w:after="40"/>
         <w:ind w:left="227"/>
       </w:pPr>
@@ -4643,7 +6098,7 @@
     </w:p>
     <w:p>
       <w:pPr>
-        <w:spacing w:after="180" w:before="0"/>
+        <w:spacing w:after="40" w:before="0"/>
       </w:pPr>
       <w:r>
         <w:rPr>
@@ -4653,6 +6108,62 @@
           <w:sz w:val="19"/>
         </w:rPr>
         <w:t>Shimogyō-ku</w:t>
+      </w:r>
+    </w:p>
+    <w:p>
+      <w:pPr>
+        <w:spacing w:after="40" w:before="60"/>
+      </w:pPr>
+      <w:r>
+        <w:rPr>
+          <w:b/>
+          <w:i w:val="0"/>
+          <w:color w:val="B49650"/>
+          <w:sz w:val="19"/>
+        </w:rPr>
+        <w:t>Quando i PG arrivano</w:t>
+      </w:r>
+    </w:p>
+    <w:p>
+      <w:pPr>
+        <w:spacing w:after="40" w:before="0"/>
+        <w:ind w:left="227"/>
+      </w:pPr>
+      <w:r>
+        <w:rPr>
+          <w:b w:val="0"/>
+          <w:i/>
+          <w:sz w:val="20"/>
+        </w:rPr>
+        <w:t>Il distretto di Shimogyō: cemento grigio, bandiera, il piantone al bancone dell'androne e le bacheche con gli avvisi sbiaditi dal sole. Domenica mattina: metà scrivanie vuote, il ronzio dei ventilatori.</w:t>
+      </w:r>
+    </w:p>
+    <w:p>
+      <w:pPr>
+        <w:spacing w:after="40" w:before="60"/>
+      </w:pPr>
+      <w:r>
+        <w:rPr>
+          <w:b/>
+          <w:i w:val="0"/>
+          <w:color w:val="B49650"/>
+          <w:sz w:val="19"/>
+        </w:rPr>
+        <w:t>Quando entrano</w:t>
+      </w:r>
+    </w:p>
+    <w:p>
+      <w:pPr>
+        <w:spacing w:after="180" w:before="0"/>
+        <w:ind w:left="227"/>
+      </w:pPr>
+      <w:r>
+        <w:rPr>
+          <w:b w:val="0"/>
+          <w:i/>
+          <w:sz w:val="20"/>
+        </w:rPr>
+        <w:t>La sala della squadra: scrivanie accoppiate, telefoni a disco, faldoni legati con lo spago, la lavagna dei turni con i nomi in gesso. Posacenere pieni da ieri. In fondo, dietro un vetro smerigliato, l'ufficio del capo ispettore: quando la porta è aperta, è meglio entrare subito.</w:t>
       </w:r>
     </w:p>
     <w:p>
@@ -4713,6 +6224,62 @@
     </w:p>
     <w:p>
       <w:pPr>
+        <w:spacing w:after="40" w:before="60"/>
+      </w:pPr>
+      <w:r>
+        <w:rPr>
+          <w:b/>
+          <w:i w:val="0"/>
+          <w:color w:val="B49650"/>
+          <w:sz w:val="19"/>
+        </w:rPr>
+        <w:t>Quando i PG arrivano</w:t>
+      </w:r>
+    </w:p>
+    <w:p>
+      <w:pPr>
+        <w:spacing w:after="40" w:before="0"/>
+        <w:ind w:left="227"/>
+      </w:pPr>
+      <w:r>
+        <w:rPr>
+          <w:b w:val="0"/>
+          <w:i/>
+          <w:sz w:val="20"/>
+        </w:rPr>
+        <w:t>I capannoni di Murasakino, Kita-ku: lamiera, ruggine e erba nelle crepe del cemento. Un cortile di carico con il cancello scorrevole, una guardiola all'ingresso col vetro rotto. Sotto una tettoia, due Honda CBX400F gemelle, bianche e rosse — e se i motori sono accesi, il canto della yonfore si riconosce a tre isolati.</w:t>
+      </w:r>
+    </w:p>
+    <w:p>
+      <w:pPr>
+        <w:spacing w:after="40" w:before="60"/>
+      </w:pPr>
+      <w:r>
+        <w:rPr>
+          <w:b/>
+          <w:i w:val="0"/>
+          <w:color w:val="B49650"/>
+          <w:sz w:val="19"/>
+        </w:rPr>
+        <w:t>Quando entrano</w:t>
+      </w:r>
+    </w:p>
+    <w:p>
+      <w:pPr>
+        <w:spacing w:after="40" w:before="0"/>
+        <w:ind w:left="227"/>
+      </w:pPr>
+      <w:r>
+        <w:rPr>
+          <w:b w:val="0"/>
+          <w:i/>
+          <w:sz w:val="20"/>
+        </w:rPr>
+        <w:t>Dentro, la vecchia fabbrica smontata: le linee ferme, gli spogliatoi con gli armadietti sfondati, attrezzi e catene appesi, odore di benzina e grasso. L'ufficio del capoturno è diventato l'angolo di Matsui: una poltrona sfondata, poster di moto, casse di birra vuote. Materassi per terra: qualcuno qui ci dorme.</w:t>
+      </w:r>
+    </w:p>
+    <w:p>
+      <w:pPr>
         <w:spacing w:after="40"/>
         <w:ind w:left="227"/>
       </w:pPr>
@@ -4797,7 +6364,7 @@
     </w:p>
     <w:p>
       <w:pPr>
-        <w:spacing w:after="180"/>
+        <w:spacing w:after="40"/>
         <w:ind w:left="227"/>
       </w:pPr>
       <w:r>
@@ -4813,6 +6380,62 @@
           <w:sz w:val="20"/>
         </w:rPr>
         <w:t>Watanabe Noriko</w:t>
+      </w:r>
+    </w:p>
+    <w:p>
+      <w:pPr>
+        <w:spacing w:after="40" w:before="60"/>
+      </w:pPr>
+      <w:r>
+        <w:rPr>
+          <w:b/>
+          <w:i w:val="0"/>
+          <w:color w:val="B49650"/>
+          <w:sz w:val="19"/>
+        </w:rPr>
+        <w:t>Quando i PG arrivano</w:t>
+      </w:r>
+    </w:p>
+    <w:p>
+      <w:pPr>
+        <w:spacing w:after="40" w:before="0"/>
+        <w:ind w:left="227"/>
+      </w:pPr>
+      <w:r>
+        <w:rPr>
+          <w:b w:val="0"/>
+          <w:i/>
+          <w:sz w:val="20"/>
+        </w:rPr>
+        <w:t>Takatsuji-dōri 3-12: la merceria di famiglia al piano strada, cesti di bottoni e rotoli di stoffa fin sul marciapiede. I genitori dietro il banco — al telefono di casa rispondono loro, sempre. Una scala laterale stretta sale all'appartamento.</w:t>
+      </w:r>
+    </w:p>
+    <w:p>
+      <w:pPr>
+        <w:spacing w:after="40" w:before="60"/>
+      </w:pPr>
+      <w:r>
+        <w:rPr>
+          <w:b/>
+          <w:i w:val="0"/>
+          <w:color w:val="B49650"/>
+          <w:sz w:val="19"/>
+        </w:rPr>
+        <w:t>Quando entrano</w:t>
+      </w:r>
+    </w:p>
+    <w:p>
+      <w:pPr>
+        <w:spacing w:after="180" w:before="0"/>
+        <w:ind w:left="227"/>
+      </w:pPr>
+      <w:r>
+        <w:rPr>
+          <w:b w:val="0"/>
+          <w:i/>
+          <w:sz w:val="20"/>
+        </w:rPr>
+        <w:t>La casa sopra la bottega odora di stoffa nuova e riso. Stanze strette, pareti sottili: qui sotto sentono tutto, e Noriko lo sa — parla a voce bassa, la porta accostata. Nella sua stanza, appeso alla borsa, il pocket bell: ogni tanto lo guarda come si guarda una cosa che morde.</w:t>
       </w:r>
     </w:p>
     <w:p>
@@ -6638,6 +8261,20 @@
     </w:p>
     <w:p>
       <w:pPr>
+        <w:spacing w:after="60" w:before="0"/>
+        <w:ind w:left="227"/>
+      </w:pPr>
+      <w:r>
+        <w:rPr>
+          <w:b w:val="0"/>
+          <w:i w:val="0"/>
+          <w:sz w:val="21"/>
+        </w:rPr>
+        <w:t>GM: Se viene inviato il fascicolo o ladeposizioine oppure fatta una chiamata possono associare la moto alla banda di Matsui Kenta</w:t>
+      </w:r>
+    </w:p>
+    <w:p>
+      <w:pPr>
         <w:spacing w:after="40"/>
         <w:ind w:left="227"/>
       </w:pPr>
@@ -6676,7 +8313,33 @@
           <w:i/>
           <w:sz w:val="19"/>
         </w:rPr>
-        <w:t>Se viene inviato il fascicolo o ladeposizioine oppure fatta una chiamata possono associare la moto alla banda di Matsui Kenta</w:t>
+        <w:t>KŌBAN DI KAMIGYŌ — Riscontro alla richiesta del Distretto di Shimogyō (procedimento Shimada).</w:t>
+        <w:br/>
+        <w:br/>
+        <w:t>Le due motociclette segnalate — Honda CBX400F, livrea bianco-rossa «tricolor», targa piegata verso l'alto, sella a tre gradini con schienalone cromato, scarichi takeyari smarmittati — corrispondono a due esemplari ben noti a questo posto di polizia: appartengono al gruppo di motociclisti (bōsōzoku) che fa capo a MATSUI Kenta, responsabile in zona di schiamazzi notturni, gare su strada e danneggiamenti. Si allega fotografia di polizia del suddetto.</w:t>
+        <w:br/>
+        <w:br/>
+        <w:t>Il gruppo conta quattro-cinque elementi stabili. Si segnala inoltre che l'elemento di spicco SUGIMOTO Hideki (anni 24) è stato sottoposto a controllo dal sottoscritto in data 15 maggio u.s., in Kamigyō: si guardava attorno con insistenza, come chi segue qualcuno; nulla da contestare al momento del controllo.</w:t>
+        <w:br/>
+        <w:br/>
+        <w:t>Per l'ubicazione del ritrovo abituale del gruppo, questo ufficio può fornire riscontro su richiesta specifica.</w:t>
+        <w:br/>
+        <w:br/>
+        <w:t>Il capo posto — SUZUKI Nobuyuki 鈴木 信之</w:t>
+      </w:r>
+    </w:p>
+    <w:p>
+      <w:pPr>
+        <w:spacing w:after="40" w:before="0"/>
+        <w:ind w:left="454"/>
+      </w:pPr>
+      <w:r>
+        <w:rPr>
+          <w:b w:val="0"/>
+          <w:i/>
+          <w:sz w:val="19"/>
+        </w:rPr>
+        <w:t>Fascicolo CBX400F — Kōban di Kamigyō</w:t>
       </w:r>
     </w:p>
     <w:p>
@@ -6777,6 +8440,29 @@
           <w:sz w:val="18"/>
         </w:rPr>
         <w:t xml:space="preserve">  handout</w:t>
+      </w:r>
+    </w:p>
+    <w:p>
+      <w:pPr>
+        <w:spacing w:after="40" w:before="0"/>
+        <w:ind w:left="454"/>
+      </w:pPr>
+      <w:r>
+        <w:rPr>
+          <w:b w:val="0"/>
+          <w:i/>
+          <w:sz w:val="19"/>
+        </w:rPr>
+        <w:t>KŌBAN DI KAMIGYŌ — Riscontro alla richiesta relativa al luogo di ritrovo del gruppo di MATSUI Kenta.</w:t>
+        <w:br/>
+        <w:br/>
+        <w:t>Da appostamenti di questo ufficio e da segnalazioni ripetute dei residenti (motori a tarda notte), il gruppo dispone in uso stabile di un capannone tra i capannoni industriali di Murasakino, Kita-ku: una ex fabbrica con cortile di carico e guardiola sull'ingresso. Le due CBX400F vi sono state viste rientrare più volte, anche nelle ultime settimane.</w:t>
+        <w:br/>
+        <w:br/>
+        <w:t>Si allega planimetria di massima. Si raccomanda prudenza: il gruppo non ha mai mostrato disponibilità al dialogo con questo ufficio.</w:t>
+        <w:br/>
+        <w:br/>
+        <w:t>Il capo posto — SUZUKI Nobuyuki 鈴木 信之</w:t>
       </w:r>
     </w:p>
     <w:p>

</xml_diff>